<commit_message>
Publish v1.6.0: scene progression and asset-bound prompts
</commit_message>
<xml_diff>
--- a/使用指南.docx
+++ b/使用指南.docx
@@ -24,7 +24,7 @@
         <w:rPr>
           <w:b/>
         </w:rPr>
-        <w:t>个人使用指南 · 版本 1.5.0</w:t>
+        <w:t>个人使用指南 · 版本 1.6.0</w:t>
       </w:r>
       <w:r/>
     </w:p>
@@ -35,7 +35,12 @@
     </w:p>
     <w:p>
       <w:r>
-        <w:t>本版要求：没有总时长先询问；信息齐备后的第一份正式方案就给完整脚本，并交齐各阶段人物、场景、物品设定图词、逐段视频词及项目适用的配套制作提示词。你无需反复索要或拼接公共风格、主体、动作和约束。正式方案与本指南均交付可编辑的 Word（.docx）文档，不再默认导出 PDF；正文和提示词都可直接修改、选择和复制。</w:t>
+        <w:t>本版要求：没有总时长先询问；信息齐备后的第一份正式方案就给完整脚本，并交齐各阶段人物、场景、物品设定图词、逐段视频词及项目适用的配套制作提示词。详细外观和空间设定集中写在资产卡，每段只列实际参与资产与版本，并给一整块动态提示词；你无需反复索要或拼接。正式方案与本指南均交付可编辑的 Word（.docx）文档，不再默认导出 PDF；正文和提示词都可直接修改、选择和复制。</w:t>
+      </w:r>
+    </w:p>
+    <w:p>
+      <w:r>
+        <w:t>本版重点补全走位、场景变化、切镜和神态变化的因果与持续状态，防止角色前进后背景无故重置。单次生成任务默认至少 10 秒，也可按故事延长；内部镜头可以更短。时长受用户目标和实际工具上限约束，不能靠停顿或循环凑时长。</w:t>
       </w:r>
     </w:p>
     <w:p>
@@ -118,7 +123,7 @@
         <w:pStyle w:val="PromptText"/>
       </w:pPr>
       <w:r>
-        <w:t>写齐各段视频和本片会用到的转场、插镜、声音与修复备选。</w:t>
+        <w:t>每次生成默认至少 10 秒，按剧情和节奏决定更长的段落，不把每个动作另拆一段。</w:t>
       </w:r>
     </w:p>
     <w:p>
@@ -126,16 +131,32 @@
         <w:pStyle w:val="PromptText"/>
       </w:pPr>
       <w:r>
-        <w:t>分开告诉我上传什么、放在哪个实际输入位置，以及复制哪一段。</w:t>
+        <w:t>资产卡写全外观和空间；视频词只写本段绑定、动作、神态、场景变化与持续到结束的状态。</w:t>
       </w:r>
     </w:p>
     <w:p>
-      <w:r>
-        <w:t>日常用自然语言沟通即可，无需先填写复杂表格。skill 提供方案，不自动联网、生成图片或视频、安装工具、购买额度或上传素材。指南中的案例是虚构教学设定，不是已生成成片或真实产品承诺。</w:t>
+      <w:pPr>
+        <w:pStyle w:val="PromptText"/>
+      </w:pPr>
+      <w:r>
+        <w:t>写齐各段视频和本片会用到的转场、插镜、声音与修复备选。</w:t>
       </w:r>
     </w:p>
     <w:p>
       <w:pPr>
+        <w:pStyle w:val="PromptText"/>
+      </w:pPr>
+      <w:r>
+        <w:t>分开告诉我上传什么、放在哪个实际输入位置，以及复制哪一段。</w:t>
+      </w:r>
+    </w:p>
+    <w:p>
+      <w:r>
+        <w:t>日常用自然语言沟通即可，无需先填写复杂表格。skill 提供方案，不自动联网、生成图片或视频、安装工具、购买额度或上传素材。指南中的案例是虚构教学设定，不是已生成成片或真实产品承诺。</w:t>
+      </w:r>
+    </w:p>
+    <w:p>
+      <w:pPr>
         <w:pStyle w:val="Heading1"/>
         <w:pageBreakBefore/>
       </w:pPr>
@@ -365,7 +386,7 @@
     </w:p>
     <w:p>
       <w:r>
-        <w:t>没有合适运动源时，不把拍摄、三维建模或深度参考变成必做步骤。可以保留故事目的，缩短动作、减小走位或采用其他模式。</w:t>
+        <w:t>没有合适运动源时，不把拍摄、三维建模或深度参考变成必做步骤。可以保留故事目的，简化动作、减小走位或采用其他模式；不因此把每个小动作拆成独立的短生成任务。</w:t>
       </w:r>
     </w:p>
     <w:p>
@@ -458,7 +479,7 @@
     </w:p>
     <w:p>
       <w:r>
-        <w:t>只有已提供可访问的真实片段，且当前模式支持延长时，才规划续接。读取实际结尾的姿态、朝向、速度趋势、接触关系、摄影机运动和声音；旧提示词中的预想结尾不能代替视频事实。</w:t>
+        <w:t>首版可按计划中的前序片段写齐条件性续接方案与完整提示词，并标明源片尚待生成和认可。实际执行延长前，必须确认当前模式支持，并检查可访问且已选定的真实源片结尾：姿态、朝向、速度趋势、接触关系、摄影机运动和声音。若实际结果偏离计划，先据此更新续接词；计划结尾不能冒充已经观察到的视频事实。</w:t>
       </w:r>
     </w:p>
     <w:p>
@@ -526,66 +547,61 @@
     </w:p>
     <w:p>
       <w:r>
-        <w:t>没有指定场景时，依据产品事实、人物角色、视频想法和目标风格，默认给约六个“优先适配”与“探索方向”建议。说明为什么适合、能表现什么、灯光与动作如何落实，以及避免什么误解，不按关键词机械匹配。</w:t>
+        <w:t>未指定场景时，默认推荐约六个“优先适配”与“探索方向”，说明可见画面、适配理由和不确定项。已有场景或氛围就沿用，只对事实或动作冲突建议最小调整。标记库中原方案、S 编号改编或新创作，不改写原有 60 场景、180 套方案。</w:t>
       </w:r>
     </w:p>
     <w:p>
       <w:r>
-        <w:t>已有指定场景或氛围时直接沿用，在其中补充构图、事件和细节；只有与事实、硬约束或动作可达性冲突时才指出并建议最小调整。标记沿用库中方案、S 编号改编或新创作，原有 60 场景、180 套风格方案不变。</w:t>
+        <w:t>已有构思就展开；未定方向但要完整方案时推荐主案并完成第一版。仅在你明确要求先选方向时停留在提案阶段。</w:t>
       </w:r>
     </w:p>
     <w:p>
-      <w:r>
-        <w:t>已有方向或构思就直接展开。未定方向可比较简要备选、说明推荐主案，并完成主案的第一版；不默认停在三个方向等下一轮。只有你明确要求“先看方向再选”才停留在该阶段。</w:t>
+      <w:pPr>
+        <w:pStyle w:val="Heading2"/>
+      </w:pPr>
+      <w:r>
+        <w:t>第一版包含从开场到收尾的完整剧本</w:t>
       </w:r>
     </w:p>
     <w:p>
-      <w:pPr>
-        <w:pStyle w:val="Heading2"/>
-      </w:pPr>
-      <w:r>
-        <w:t>第一版必须是从开场到收尾的完整剧本</w:t>
+      <w:r>
+        <w:t>逐段写时间、故事任务、地点阶段、角色与物品、行为、景别运镜、台词或旁白、声音及入出段接法。没有台词就明确，不留“自行补充”。故事闭合，不硬套三幕结构。文档先给完整脚本，再给资产和执行卡。</w:t>
       </w:r>
     </w:p>
     <w:p>
-      <w:r>
-        <w:t>逐段写清时间区间、故事任务、地点与阶段、出现的角色和物品、画面、行为、景别、运镜、台词或旁白、声音、入段与出段接法。没有台词就明确无台词，不用“自行补充”代替内容。开头、发展、转折或展示重点及结尾必须闭合；三幕结构不是所有片子的硬要求。</w:t>
+      <w:pPr>
+        <w:pStyle w:val="Heading2"/>
+      </w:pPr>
+      <w:r>
+        <w:t>单次生成默认至少十秒</w:t>
       </w:r>
     </w:p>
     <w:p>
       <w:r>
-        <w:t>分清生成片段长度与最终采用时长，核对片头、片尾、留白和转场重叠后的全片时长。文档先呈现连续的完整脚本，再给资产和执行卡；不能只交分镜标题或前几段示例。</w:t>
+        <w:t>按完整事件安排 10 秒、12 秒、15 秒或更长的生成任务，依剧情和实际工具能力确定。一段可含多个更短的内部镜头；不要将每次抬手、转头或切镜拆成独立任务。区分生成时长与入剪净时长，扣除重叠后核对全片总长。</w:t>
       </w:r>
     </w:p>
     <w:p>
-      <w:pPr>
-        <w:pStyle w:val="Heading2"/>
-      </w:pPr>
-      <w:r>
-        <w:t>三到五分钟仍按事件拆段</w:t>
+      <w:r>
+        <w:t>用户指定短段或全片不足 10 秒、锁定原片长度、已核实的平台上限、必要的独立短补镜可以例外，须说明原因。平台不足时先比较兼容入口；确需分批则标明技术分次，不能将两次短生成称为一次长生成。不用无意义停顿、循环或回放凑秒，不擅自延长用户成片。</w:t>
       </w:r>
     </w:p>
     <w:p>
-      <w:r>
-        <w:t>在已确认或已获授权的总时长内安排章节、场景与事件，再拆成可单独制作和检查的段落。单段长度服从工具能力与动作难度；不固定九宫格、等分时长、产品占比或一镜到底。</w:t>
+      <w:pPr>
+        <w:pStyle w:val="Heading2"/>
+      </w:pPr>
+      <w:r>
+        <w:t>连续性记录说明变化后的去向</w:t>
       </w:r>
     </w:p>
     <w:p>
       <w:r>
-        <w:t>一段可采用源片合成，另一段使用多参考或原生多镜头。共同约束是故事事实、身份、动作状态与接缝，而不是所有段落必须使用同一种生成方式。</w:t>
+        <w:t>记录资产版本、区域路径、机位视向、物品归属、动作相位、神态、光线及锁定状态。每次变化写明触发、过程和持续结果；没有实片的字段标待验证。</w:t>
       </w:r>
     </w:p>
     <w:p>
-      <w:pPr>
-        <w:pStyle w:val="Heading2"/>
-      </w:pPr>
-      <w:r>
-        <w:t>用连续性记录连接各段</w:t>
-      </w:r>
-    </w:p>
-    <w:p>
-      <w:r>
-        <w:t>记录段号、故事任务、时长、输入与版本、工作流、起止位置和朝向、持有或佩戴关系、开合、动作阶段、摄影机运动、光线、声音、接法及锁定状态。没有实际结果的字段标为待验证。</w:t>
+      <w:r>
+        <w:t>换机位不等于回到原位置。跨区须写出离开、穿越边界、进入目的地，以及切后地标和旧区域的方位。旧背景退到身后或画外，不能自动恢复为正面布景；有意回望、返回或闪回须说明触发与时空关系。</w:t>
       </w:r>
     </w:p>
     <w:p>
@@ -601,7 +617,7 @@
         <w:t>连续承接</w:t>
       </w:r>
       <w:r>
-        <w:t>：保持实际动作相位、方向、速度趋势和接触，不能无故停住或反向。</w:t>
+        <w:t>：接上动作相位、方向、速度和接触。</w:t>
       </w:r>
     </w:p>
     <w:p>
@@ -617,7 +633,7 @@
         <w:t>匹配剪辑</w:t>
       </w:r>
       <w:r>
-        <w:t>：用相似形状、构图或运动连接不同场景，不要求环境融化为一处。</w:t>
+        <w:t>：用形状、构图或运动相似性连接不同场景。</w:t>
       </w:r>
     </w:p>
     <w:p>
@@ -633,7 +649,7 @@
         <w:t>硬切</w:t>
       </w:r>
       <w:r>
-        <w:t>：明确改变景别、地点或时间，保留故事需要的一致性。</w:t>
+        <w:t>：明确改变景别、地点或时间，保留有效故事事实。</w:t>
       </w:r>
     </w:p>
     <w:p>
@@ -649,12 +665,18 @@
         <w:t>桥接或覆盖</w:t>
       </w:r>
       <w:r>
-        <w:t>：补有用的空间、细节或反应，解决接缝与信息缺失。</w:t>
+        <w:t>：补足空间、细节或反应，解决信息与接缝问题。</w:t>
       </w:r>
     </w:p>
     <w:p>
       <w:r>
-        <w:t>长片最后仍需剪辑和完整观看。单段好看、静帧一致或总时长达到目标，都不足以证明全片连贯。</w:t>
+        <w:t xml:space="preserve">详见 </w:t>
+      </w:r>
+      <w:r>
+        <w:t>references/scene-state-progression.md</w:t>
+      </w:r>
+      <w:r>
+        <w:t>。长片可混用多参考、源片合成等路线，最后仍须剪辑和完整观看；静帧一致或时长达标不能证明动态连贯。</w:t>
       </w:r>
     </w:p>
     <w:p>
@@ -676,12 +698,12 @@
     </w:p>
     <w:p>
       <w:r>
-        <w:t>制作说明保存目标、素材职责、模式选择、待补条件、风险、备选、切点与验收标准。执行块只写本次已选输入、必要身份、动作或编辑目标、保持项、结束状态及相关约束。</w:t>
+        <w:t>制作说明保存目标、素材职责、模式选择、待补条件、风险、备选、切点与验收标准。完整人物外观、服装、初始场景陈设等静态设定只在资产卡中详写；视频执行块聚焦本段会发生的变化及必要的稳定约束。</w:t>
       </w:r>
     </w:p>
     <w:p>
       <w:r>
-        <w:t>每条执行提示词应可独立复制，包含本段需要的风格、主体、动作、场景和约束，不让你另拼公共设定。不依赖“同上”，不混入“如果 A 否则 B”、未选分支或未知占位。素材未就绪时在制作说明标待生成，不假称已上传。</w:t>
+        <w:t>每条视频提示词可整块复制，在指定资产正确上传或绑定后独立执行，不再每段重写主角定妆与起始环境。块内仅保留必要的简短参考职责、与本段有关的状态差异、动作顺序、机位和场景变化、神态演变及终点持续状态。不依赖“同上”，不混入未选分支或未知占位；没有可绑定资产的纯文本模式则写必要的最小识别信息，不能让模型凭空理解资产编号。素材未就绪时在制作说明标待生成，不假称已上传。</w:t>
       </w:r>
     </w:p>
     <w:p>
@@ -813,7 +835,12 @@
     </w:p>
     <w:p>
       <w:r>
-        <w:t>提示词详细程度以可观察与可检查为准，不以字数保证质量。</w:t>
+        <w:t>提示词详细程度以可观察与可检查为准，不以字数保证质量。每个重要变化写清谁因为什么，沿何路径，以什么速度和动作相位变化，机位怎样跟随或切换，新状态保持到何时。神态用视线、眉眼、唇角、呼吸、肩颈和姿态的小幅变化表达，并给触发、过渡和保持时间；不把所有情绪堆在同一秒。</w:t>
+      </w:r>
+    </w:p>
+    <w:p>
+      <w:r>
+        <w:t>只对影响叙事或连续性的事件分配时间区间，不机械逐帧注释。时间是表演和剪辑的计划，生成结果仍须完整观看；文字更细不能保证模型绝不回跳。</w:t>
       </w:r>
     </w:p>
     <w:p>
@@ -945,7 +972,7 @@
     </w:p>
     <w:p>
       <w:r>
-        <w:t>准备齐全后，每段视频词仍完整写明风格、主体、场景、动作、运镜、终点与约束，你无需另拼公共描述。纯剪辑或设置项用操作说明交付。</w:t>
+        <w:t>每段只列本次参与的资产、明确版本及职责，不重复输出整套资产卡。准备齐全后，复制动态块即可；必要绑定句说明哪份图控制哪个主体或空间，不重抄外观和初场景。风格、灯光仅在本段改变或需要维持关键效果时写入。纯剪辑或设置项用操作说明交付。</w:t>
       </w:r>
     </w:p>
     <w:p>
@@ -994,7 +1021,7 @@
     </w:p>
     <w:p>
       <w:r>
-        <w:t>按剧情区分换装、成长、受伤、淋雨、脏污等真正变化。每阶段给完整提示词并写明继承与改变之处；不能只写“换成雨天造型”。多视角或细节图按识别需要拆成独立卡，不默认用九宫格，也不把定妆照写成连续动作图。</w:t>
+        <w:t>按剧情区分换装、成长、受伤、淋雨、脏污等真正变化。每阶段资产卡给完整提示词，并具体记录水迹位置、衣物贴附、污渍范围等可观察差异及继承项；不能只写“换成雨天造型”。脸型、服装层次、配件位置和左右侧关系足以区别时才算明确，不用成串“精致高级”代替设计。多视角或细节图按识别需要拆成独立卡，不默认用九宫格，也不把定妆照写成连续动作图。</w:t>
       </w:r>
     </w:p>
     <w:p>
@@ -1007,7 +1034,7 @@
     </w:p>
     <w:p>
       <w:r>
-        <w:t>写清室内外、可见空间尺度和纵深、地面与墙体、出入口、前中后景、主要陈设、主体活动区、摄影机观察方向、主光来源、时段天气、材质与配色。必要时另给无角色的干净环境图、背景层或空间关系图。</w:t>
+        <w:t>写清室内外、可见空间尺度和纵深、地面与墙体、出入口、前中后景、主要陈设、主体活动区、摄影机观察方向、主光来源、时段天气、材质与配色。跨空间动作另写区域之间的连接关系、门洞或拐角、路径距离、主要地标的相对位置、遮挡点与目的地活动区。必要时另给干净环境图、空间关系图或目的地区域视角，不能指望一个起点构图自动控制所有新背景。</w:t>
       </w:r>
     </w:p>
     <w:p>
@@ -1179,7 +1206,7 @@
     </w:p>
     <w:p>
       <w:r>
-        <w:t>每个执行块已包含当次所需的主体设定、场景阶段、动作、构图或运镜、光线风格与约束。不用“同上”“自行填充”“公共词加本段动作”代替内容。不同用途分块，主案与备选分开，避免把全部提示词一次塞给生成工具。</w:t>
+        <w:t>资产图块包含该资产及阶段的完整可见设定。视频块在绑定已列资产的前提下包含当次完整动态，不重复完整定妆和初始场景：只写本段动作、场景与机位转换、情绪可见变化、必要状态及约束。不用“同上”“自行填充”“公共词加本段动作”代替执行内容。不同用途分块，主案与备选分开，避免把全部提示词一次塞给生成工具。</w:t>
       </w:r>
     </w:p>
     <w:p>
@@ -1197,7 +1224,7 @@
     </w:p>
     <w:p>
       <w:r>
-        <w:t>完整脚本是否覆盖全时长；每个角色、场景、重要物品和阶段是否有对应设定词；每个片段、计划转场和音轨是否能找到执行块；每个执行块依赖是否已有或有准备说明；备选能否直接替换且不破坏锁定内容。</w:t>
+        <w:t>完整脚本是否覆盖全时长；单次生成是否默认至少 10 秒、例外是否有理由；每个空间与神态变化是否有触发、过程及保持状态；资产编号是否映射到真实文件和正确版本；每个角色、场景、重要物品和阶段是否有对应设定词；每个片段、计划转场和音轨是否能找到执行块；每个执行块依赖是否已有或有准备说明；备选能否直接替换且不破坏锁定内容。</w:t>
       </w:r>
     </w:p>
     <w:p>
@@ -1441,15 +1468,20 @@
     </w:p>
     <w:p>
       <w:r>
-        <w:t>将观察事实与原因假设分开。可以关联调整必要项，但不要每次同时重做身份、光线、机位与故事来掩盖局部问题。原版本保留，新版本说明变化与影响。</w:t>
+        <w:t>背景突然回到开头时，先记录发生时间和可见变化，再核对是否只上传起点场景、是否缺少目的地或连接空间、参考职责是否混淆、切镜是否被误解为重开场。补足空间资料、路径、切换后的地标与持续状态，并为偏差区间提供完整新动态块；不要只增加“不要回到开头”这一句。</w:t>
       </w:r>
     </w:p>
     <w:p>
       <w:r>
-        <w:t>新模型、增强、插帧或后期处理先看代表镜头的可见收益；没有证据时，不自动重做已认可片段。方案可降低歧义，不能承诺零穿帮或固定提升率。</w:t>
+        <w:t>将观察事实与原因假设分开。可以关联调整必要项，但不要每次同时重做身份、光线、机位与故事来掩盖局部问题。原版本保留，新版本说明变化与影响。</w:t>
       </w:r>
     </w:p>
     <w:p>
+      <w:r>
+        <w:t>新模型、增强、插帧或后期处理先看代表镜头的可见收益；没有证据时，不自动重做已认可片段。方案可降低歧义，不能承诺零穿帮或固定提升率。</w:t>
+      </w:r>
+    </w:p>
+    <w:p>
       <w:pPr>
         <w:pStyle w:val="Heading1"/>
         <w:pageBreakBefore/>
@@ -1553,6 +1585,162 @@
       </w:r>
       <w:r>
         <w:t xml:space="preserve"> 本地 Word 导出辅助支持中文 Markdown、标题、列表、表格、分页与长提示词，不联网。需要现有 Python、python-docx 和覆盖文稿字符的中文字体，缺失时明确报错。Word 正文、表格与提示词保留为可编辑文本，不把 PDF 页面或截图嵌入文档充当正文。导出后检查内容完整性与分页版式，内部渲染可用于检查，但不作为 PDF 附件交付。指南不代表安装、平台发布或实际媒体生成已经完成。</w:t>
+      </w:r>
+    </w:p>
+    <w:p>
+      <w:pPr>
+        <w:pStyle w:val="Heading1"/>
+        <w:pageBreakBefore/>
+      </w:pPr>
+      <w:r>
+        <w:t>13   例 先把人物与连通空间准备准确</w:t>
+      </w:r>
+    </w:p>
+    <w:p>
+      <w:r>
+        <w:t>这是一个虚构叙事短片的教学片段：人物听到庭院方向的提示声，从展厅穿过短廊，跑到庭院入口停下。单次生成计划为 12 秒，含三个内部镜头。下列资产卡用于一次性准备，不在每条视频词中重复。</w:t>
+      </w:r>
+    </w:p>
+    <w:p>
+      <w:pPr>
+        <w:pStyle w:val="Heading2"/>
+      </w:pPr>
+      <w:r>
+        <w:t>A01 v1 人物身份参考</w:t>
+      </w:r>
+    </w:p>
+    <w:p>
+      <w:r>
+        <w:t xml:space="preserve">用途：控制同一人物的脸、服装与配件位置。计划文件名 </w:t>
+      </w:r>
+      <w:r>
+        <w:t>A01-v1.png</w:t>
+      </w:r>
+      <w:r>
+        <w:t>，尚待生成并认可；不是已上传文件。</w:t>
+      </w:r>
+    </w:p>
+    <w:p>
+      <w:pPr>
+        <w:pStyle w:val="PromptText"/>
+      </w:pPr>
+      <w:r>
+        <w:t>写实电影角色设定照，一名虚构的成年女性，短直发齐下颌、左侧分缝，椭圆脸，眉形平直，眼睛深棕色。中等身高，体型匀称。穿合身的深蓝色长袖短外套、米白圆领内搭、直筒深灰长裤和低帮黑鞋，布料不带图案和文字。黑色小斜挎包从右肩斜跨至左腰，细肩带贴合身体，包盖闭合。全身三分之四正面，双臂自然下垂，双脚完整入画，表情平静，视线平视。浅灰干净背景，均匀柔光，脸部和衣物结构清楚，不做剧情动作，不增加其他人物或手持物。</w:t>
+      </w:r>
+    </w:p>
+    <w:p>
+      <w:pPr>
+        <w:pStyle w:val="Heading2"/>
+      </w:pPr>
+      <w:r>
+        <w:t>E01 v1 连通环境参考</w:t>
+      </w:r>
+    </w:p>
+    <w:p>
+      <w:r>
+        <w:t xml:space="preserve">用途：控制三个区域的空间关系。计划文件名 </w:t>
+      </w:r>
+      <w:r>
+        <w:t>E01-v1.png</w:t>
+      </w:r>
+      <w:r>
+        <w:t>，尚待生成并认可。若当前入口无法从整体图稳定识别目的地区域，先补同布局的目的地独立视角，不虚构已经受控。</w:t>
+      </w:r>
+    </w:p>
+    <w:p>
+      <w:pPr>
+        <w:pStyle w:val="PromptText"/>
+      </w:pPr>
+      <w:r>
+        <w:t>写实电影场景设计，单一连续空间的侧上方宽幅建立视角，无人物。左侧是小型展厅，中央是一条约四米长的有顶直走廊，右侧是露天庭院，三个区域沿同一直线连接。展厅右墙只有一个矩形门洞，门洞直接连入走廊；走廊另一端直接通向庭院，没有岔路或传送门。展厅地面为浅灰石板，靠后墙有两座空白石台；走廊地面延续同种石板，背面墙排列三个窄窗；庭院地面为较粗的浅色石砖，远端有一棵细叶树和低石凳。通行带前方无遮拦，能够辨认两道门界和连续路面。清晨柔和自然光，室内较暗、走廊逐渐变亮、庭院明亮但不过曝，三处材质和建筑尺度一致，不拼成多个独立场景，不增加门洞。</w:t>
+      </w:r>
+    </w:p>
+    <w:p>
+      <w:r>
+        <w:t>角色身上的斜挎包已在 A01 控制；本例无独立产品展示、开包或交接，所以不额外制造道具图任务。正式项目若需要包的近景或结构变化，另提供对应物品卡。只有角色和环境两份资料都检查通过，才能把它们登记为本段的已就绪输入。</w:t>
+      </w:r>
+    </w:p>
+    <w:p>
+      <w:pPr>
+        <w:pStyle w:val="Heading1"/>
+        <w:pageBreakBefore/>
+      </w:pPr>
+      <w:r>
+        <w:t>14   例 只把这一段的变化写入视频词</w:t>
+      </w:r>
+    </w:p>
+    <w:p>
+      <w:pPr>
+        <w:pStyle w:val="Heading2"/>
+      </w:pPr>
+      <w:r>
+        <w:t>本次输入和执行条件</w:t>
+      </w:r>
+    </w:p>
+    <w:p>
+      <w:r>
+        <w:t>参与资产为 A01 v1 人物参考与 E01 v1 连通环境参考。生成前选择这两份已认可文件，按当前入口分别赋予人物身份和空间布局职责；编号只是档案索引。此例假定所选模式支持 12 秒、两份参考和明确的内部切镜；不支持时先调整任务或换兼容路线。音效若不由本次生成支持，则在剪辑中单独添加。</w:t>
+      </w:r>
+    </w:p>
+    <w:p>
+      <w:pPr>
+        <w:pStyle w:val="Heading2"/>
+      </w:pPr>
+      <w:r>
+        <w:t>整块复制的 12 秒动态提示词</w:t>
+      </w:r>
+    </w:p>
+    <w:p>
+      <w:pPr>
+        <w:pStyle w:val="PromptText"/>
+      </w:pPr>
+      <w:r>
+        <w:t>人物身份与穿着采用人物参考，展厅、直走廊和庭院的连接关系采用环境参考。12 秒内沿这条路线持续前进，摄影机始终位于通行带的同一侧，人物在各镜保持从画面左侧向右侧移动。</w:t>
+      </w:r>
+    </w:p>
+    <w:p>
+      <w:pPr>
+        <w:pStyle w:val="PromptText"/>
+      </w:pPr>
+      <w:r>
+        <w:t>0 至 3 秒：中景侧面。人物位于展厅门洞左侧约两米处，起初望向展厅前方。庭院方向传来一次轻短提示声；她先把视线转向右侧门洞，眉梢轻抬，嘴唇微分，随后收拢下巴、身体前倾，向门洞跑去。起跑后保持专注，目光沿路线向前，不回头。摄影机平行跟移，右墙门洞逐渐移至人物身后。</w:t>
+      </w:r>
+    </w:p>
+    <w:p>
+      <w:pPr>
+        <w:pStyle w:val="PromptText"/>
+      </w:pPr>
+      <w:r>
+        <w:t>3 至 7 秒：她整个身体越过第一道门界后，切至走廊内侧面中景，接住同一向右跑动的步伐和速度，不能重新演起跑。摄影机继续平行跟移。三个窄窗依次从她身后向画面左侧掠过，展厅门洞退到左后方并离开取景；她前方的庭院出口逐渐扩大。她肩颈略紧、嘴唇轻合，注意力保持在出口，斜挎包仍在左腰随步伐小幅摆动。</w:t>
+      </w:r>
+    </w:p>
+    <w:p>
+      <w:pPr>
+        <w:pStyle w:val="PromptText"/>
+      </w:pPr>
+      <w:r>
+        <w:t>7 至 10 秒：人物越过第二道门界后，切到庭院内同侧中全景，承接向右的跑步。主体进入自然光，曝光平顺适应。走廊出口留在左后方；前方可见细叶树与石凳。她看见树旁空地后开始减速，步幅逐渐缩短，双臂摆动减小，直到在入口右前方约两米处停稳。</w:t>
+      </w:r>
+    </w:p>
+    <w:p>
+      <w:pPr>
+        <w:pStyle w:val="PromptText"/>
+      </w:pPr>
+      <w:r>
+        <w:t>10 至 12 秒：摄影机缓慢停止跟移。人物在庭院内平稳呼出一口气，肩部放松，嘴角微微上扬，目光仍向右前方；保持这一安定状态直到结束。树、石凳和左后方走廊入口的位置保持连续。结尾不回到展厅，不重放起跑，不反向跑动，也不把目的地背景替换为起点背景。</w:t>
+      </w:r>
+    </w:p>
+    <w:p>
+      <w:pPr>
+        <w:pStyle w:val="Heading2"/>
+      </w:pPr>
+      <w:r>
+        <w:t>检查与返修</w:t>
+      </w:r>
+    </w:p>
+    <w:p>
+      <w:r>
+        <w:t>检查两道门界的穿越是否完成、切镜后速度和方向是否承接、地标是否按路线退后，以及放松神态是否由到达庭院触发。若第 3 秒后重现展厅背景，先查输入是否包含连接空间和目的地，再修受影响区间；保留已认可的身份与可用镜头。时间区间是计划，不是生成器逐秒准确执行的保证。本例展示组织方式，正式项目须给自己的全部片段完整动态块。</w:t>
       </w:r>
     </w:p>
     <w:sectPr>

</xml_diff>

<commit_message>
Publish v1.6.1: story-driven state progression across genres
</commit_message>
<xml_diff>
--- a/使用指南.docx
+++ b/使用指南.docx
@@ -24,7 +24,7 @@
         <w:rPr>
           <w:b/>
         </w:rPr>
-        <w:t>个人使用指南 · 版本 1.6.0</w:t>
+        <w:t>个人使用指南 · 版本 1.6.1</w:t>
       </w:r>
       <w:r/>
     </w:p>
@@ -40,7 +40,7 @@
     </w:p>
     <w:p>
       <w:r>
-        <w:t>本版重点补全走位、场景变化、切镜和神态变化的因果与持续状态，防止角色前进后背景无故重置。单次生成任务默认至少 10 秒，也可按故事延长；内部镜头可以更短。时长受用户目标和实际工具上限约束，不能靠停顿或循环凑时长。</w:t>
+        <w:t>本版补全走位、换景、神态与事件后果的持续状态：角色前进后背景不应无故重置，疲劳、衣物脏湿和物品变化也应按因果承接。单次生成任务默认至少 10 秒，按故事可更长；内部镜头可更短。时长服从用户目标和工具上限，不靠停顿或循环凑时长。</w:t>
       </w:r>
     </w:p>
     <w:p>
@@ -1741,6 +1741,634 @@
     <w:p>
       <w:r>
         <w:t>检查两道门界的穿越是否完成、切镜后速度和方向是否承接、地标是否按路线退后，以及放松神态是否由到达庭院触发。若第 3 秒后重现展厅背景，先查输入是否包含连接空间和目的地，再修受影响区间；保留已认可的身份与可用镜头。时间区间是计划，不是生成器逐秒准确执行的保证。本例展示组织方式，正式项目须给自己的全部片段完整动态块。</w:t>
+      </w:r>
+    </w:p>
+    <w:p>
+      <w:pPr>
+        <w:pStyle w:val="Heading1"/>
+        <w:pageBreakBefore/>
+      </w:pPr>
+      <w:r>
+        <w:t>15   任何剧情都要承接故事中的状态变化</w:t>
+      </w:r>
+    </w:p>
+    <w:p>
+      <w:pPr>
+        <w:pStyle w:val="Heading2"/>
+      </w:pPr>
+      <w:r>
+        <w:t>从事件推导新状态 不局限身体变化</w:t>
+      </w:r>
+    </w:p>
+    <w:p>
+      <w:r>
+        <w:t>记录本片相关的角色知识、关系、目标进度，以及身体情绪、物品、制作阶段、环境与时空状态。每个事件只改变有因果关系的部分，其余延续；不要求每类都变，不机械增加受伤或破损。发现线索、建立信任、完成装配和植物生长都适用。</w:t>
+      </w:r>
+    </w:p>
+    <w:p>
+      <w:r>
+        <w:t>每次变化写清触发、发生时刻、前后差异、可见证据和持续范围。后段继承新状态，直到新的事件、操作或时间经过使其改变。计划与实际素材观察分别记录，不把未生成结果写成已验证事实。</w:t>
+      </w:r>
+    </w:p>
+    <w:p>
+      <w:pPr>
+        <w:pStyle w:val="Heading2"/>
+      </w:pPr>
+      <w:r>
+        <w:t>用不同题材检查同一条因果链</w:t>
+      </w:r>
+    </w:p>
+    <w:tbl>
+      <w:tblPr>
+        <w:tblW w:type="auto" w:w="0"/>
+        <w:tblLayout w:type="fixed"/>
+        <w:tblLook w:firstColumn="1" w:firstRow="1" w:lastColumn="0" w:lastRow="0" w:noHBand="0" w:noVBand="1" w:val="04A0"/>
+        <w:tblBorders>
+          <w:top w:val="single" w:sz="4" w:color="D9D9D9"/>
+          <w:left w:val="single" w:sz="4" w:color="D9D9D9"/>
+          <w:bottom w:val="single" w:sz="4" w:color="D9D9D9"/>
+          <w:right w:val="single" w:sz="4" w:color="D9D9D9"/>
+          <w:insideH w:val="single" w:sz="4" w:color="D9D9D9"/>
+          <w:insideV w:val="single" w:sz="4" w:color="D9D9D9"/>
+        </w:tblBorders>
+      </w:tblPr>
+      <w:tblGrid>
+        <w:gridCol w:w="1460"/>
+        <w:gridCol w:w="4381"/>
+        <w:gridCol w:w="3797"/>
+      </w:tblGrid>
+      <w:tr>
+        <w:trPr>
+          <w:tblHeader/>
+        </w:trPr>
+        <w:tc>
+          <w:tcPr>
+            <w:tcW w:type="dxa" w:w="1460"/>
+            <w:vAlign w:val="center"/>
+            <w:tcMar>
+              <w:top w:w="90" w:type="dxa"/>
+              <w:left w:w="90" w:type="dxa"/>
+              <w:bottom w:w="90" w:type="dxa"/>
+              <w:right w:w="90" w:type="dxa"/>
+            </w:tcMar>
+            <w:shd w:fill="E8EDF0"/>
+          </w:tcPr>
+          <w:p>
+            <w:pPr>
+              <w:keepNext w:val="0"/>
+              <w:spacing w:after="60" w:before="60" w:line="276" w:lineRule="auto"/>
+              <w:jc w:val="center"/>
+            </w:pPr>
+            <w:r>
+              <w:rPr>
+                <w:b/>
+                <w:sz w:val="19"/>
+              </w:rPr>
+              <w:t>情节</w:t>
+            </w:r>
+          </w:p>
+        </w:tc>
+        <w:tc>
+          <w:tcPr>
+            <w:tcW w:type="dxa" w:w="4381"/>
+            <w:vAlign w:val="center"/>
+            <w:tcMar>
+              <w:top w:w="90" w:type="dxa"/>
+              <w:left w:w="90" w:type="dxa"/>
+              <w:bottom w:w="90" w:type="dxa"/>
+              <w:right w:w="90" w:type="dxa"/>
+            </w:tcMar>
+            <w:shd w:fill="E8EDF0"/>
+          </w:tcPr>
+          <w:p>
+            <w:pPr>
+              <w:keepNext w:val="0"/>
+              <w:spacing w:after="60" w:before="60" w:line="276" w:lineRule="auto"/>
+            </w:pPr>
+            <w:r>
+              <w:rPr>
+                <w:b/>
+                <w:sz w:val="19"/>
+              </w:rPr>
+              <w:t>事件后应承接的状态</w:t>
+            </w:r>
+          </w:p>
+        </w:tc>
+        <w:tc>
+          <w:tcPr>
+            <w:tcW w:type="dxa" w:w="3797"/>
+            <w:vAlign w:val="center"/>
+            <w:tcMar>
+              <w:top w:w="90" w:type="dxa"/>
+              <w:left w:w="90" w:type="dxa"/>
+              <w:bottom w:w="90" w:type="dxa"/>
+              <w:right w:w="90" w:type="dxa"/>
+            </w:tcMar>
+            <w:shd w:fill="E8EDF0"/>
+          </w:tcPr>
+          <w:p>
+            <w:pPr>
+              <w:keepNext w:val="0"/>
+              <w:spacing w:after="60" w:before="60" w:line="276" w:lineRule="auto"/>
+            </w:pPr>
+            <w:r>
+              <w:rPr>
+                <w:b/>
+                <w:sz w:val="19"/>
+              </w:rPr>
+              <w:t>下一段何时才能改变</w:t>
+            </w:r>
+          </w:p>
+        </w:tc>
+      </w:tr>
+      <w:tr>
+        <w:tc>
+          <w:tcPr>
+            <w:tcW w:type="dxa" w:w="1460"/>
+            <w:vAlign w:val="center"/>
+            <w:tcMar>
+              <w:top w:w="90" w:type="dxa"/>
+              <w:left w:w="90" w:type="dxa"/>
+              <w:bottom w:w="90" w:type="dxa"/>
+              <w:right w:w="90" w:type="dxa"/>
+            </w:tcMar>
+          </w:tcPr>
+          <w:p>
+            <w:pPr>
+              <w:keepNext w:val="0"/>
+              <w:spacing w:after="60" w:before="60" w:line="276" w:lineRule="auto"/>
+              <w:jc w:val="center"/>
+            </w:pPr>
+            <w:r>
+              <w:rPr>
+                <w:sz w:val="19"/>
+              </w:rPr>
+              <w:t>雨中奔跑</w:t>
+            </w:r>
+          </w:p>
+        </w:tc>
+        <w:tc>
+          <w:tcPr>
+            <w:tcW w:type="dxa" w:w="4381"/>
+            <w:vAlign w:val="center"/>
+            <w:tcMar>
+              <w:top w:w="90" w:type="dxa"/>
+              <w:left w:w="90" w:type="dxa"/>
+              <w:bottom w:w="90" w:type="dxa"/>
+              <w:right w:w="90" w:type="dxa"/>
+            </w:tcMar>
+          </w:tcPr>
+          <w:p>
+            <w:pPr>
+              <w:keepNext w:val="0"/>
+              <w:spacing w:after="60" w:before="60" w:line="276" w:lineRule="auto"/>
+            </w:pPr>
+            <w:r>
+              <w:rPr>
+                <w:sz w:val="19"/>
+              </w:rPr>
+              <w:t>进入屋檐后仍湿，呼吸渐缓</w:t>
+            </w:r>
+          </w:p>
+        </w:tc>
+        <w:tc>
+          <w:tcPr>
+            <w:tcW w:type="dxa" w:w="3797"/>
+            <w:vAlign w:val="center"/>
+            <w:tcMar>
+              <w:top w:w="90" w:type="dxa"/>
+              <w:left w:w="90" w:type="dxa"/>
+              <w:bottom w:w="90" w:type="dxa"/>
+              <w:right w:w="90" w:type="dxa"/>
+            </w:tcMar>
+          </w:tcPr>
+          <w:p>
+            <w:pPr>
+              <w:keepNext w:val="0"/>
+              <w:spacing w:after="60" w:before="60" w:line="276" w:lineRule="auto"/>
+            </w:pPr>
+            <w:r>
+              <w:rPr>
+                <w:sz w:val="19"/>
+              </w:rPr>
+              <w:t>擦拭、换装或足够时间后变干</w:t>
+            </w:r>
+          </w:p>
+        </w:tc>
+      </w:tr>
+      <w:tr>
+        <w:tc>
+          <w:tcPr>
+            <w:tcW w:type="dxa" w:w="1460"/>
+            <w:vAlign w:val="center"/>
+            <w:tcMar>
+              <w:top w:w="90" w:type="dxa"/>
+              <w:left w:w="90" w:type="dxa"/>
+              <w:bottom w:w="90" w:type="dxa"/>
+              <w:right w:w="90" w:type="dxa"/>
+            </w:tcMar>
+          </w:tcPr>
+          <w:p>
+            <w:pPr>
+              <w:keepNext w:val="0"/>
+              <w:spacing w:after="60" w:before="60" w:line="276" w:lineRule="auto"/>
+              <w:jc w:val="center"/>
+            </w:pPr>
+            <w:r>
+              <w:rPr>
+                <w:sz w:val="19"/>
+              </w:rPr>
+              <w:t>倒水饮用</w:t>
+            </w:r>
+          </w:p>
+        </w:tc>
+        <w:tc>
+          <w:tcPr>
+            <w:tcW w:type="dxa" w:w="4381"/>
+            <w:vAlign w:val="center"/>
+            <w:tcMar>
+              <w:top w:w="90" w:type="dxa"/>
+              <w:left w:w="90" w:type="dxa"/>
+              <w:bottom w:w="90" w:type="dxa"/>
+              <w:right w:w="90" w:type="dxa"/>
+            </w:tcMar>
+          </w:tcPr>
+          <w:p>
+            <w:pPr>
+              <w:keepNext w:val="0"/>
+              <w:spacing w:after="60" w:before="60" w:line="276" w:lineRule="auto"/>
+            </w:pPr>
+            <w:r>
+              <w:rPr>
+                <w:sz w:val="19"/>
+              </w:rPr>
+              <w:t>倒入后液面上升，饮用后减少</w:t>
+            </w:r>
+          </w:p>
+        </w:tc>
+        <w:tc>
+          <w:tcPr>
+            <w:tcW w:type="dxa" w:w="3797"/>
+            <w:vAlign w:val="center"/>
+            <w:tcMar>
+              <w:top w:w="90" w:type="dxa"/>
+              <w:left w:w="90" w:type="dxa"/>
+              <w:bottom w:w="90" w:type="dxa"/>
+              <w:right w:w="90" w:type="dxa"/>
+            </w:tcMar>
+          </w:tcPr>
+          <w:p>
+            <w:pPr>
+              <w:keepNext w:val="0"/>
+              <w:spacing w:after="60" w:before="60" w:line="276" w:lineRule="auto"/>
+            </w:pPr>
+            <w:r>
+              <w:rPr>
+                <w:sz w:val="19"/>
+              </w:rPr>
+              <w:t>新的液体进出或蒸发改变余量</w:t>
+            </w:r>
+          </w:p>
+        </w:tc>
+      </w:tr>
+      <w:tr>
+        <w:tc>
+          <w:tcPr>
+            <w:tcW w:type="dxa" w:w="1460"/>
+            <w:vAlign w:val="center"/>
+            <w:tcMar>
+              <w:top w:w="90" w:type="dxa"/>
+              <w:left w:w="90" w:type="dxa"/>
+              <w:bottom w:w="90" w:type="dxa"/>
+              <w:right w:w="90" w:type="dxa"/>
+            </w:tcMar>
+          </w:tcPr>
+          <w:p>
+            <w:pPr>
+              <w:keepNext w:val="0"/>
+              <w:spacing w:after="60" w:before="60" w:line="276" w:lineRule="auto"/>
+              <w:jc w:val="center"/>
+            </w:pPr>
+            <w:r>
+              <w:rPr>
+                <w:sz w:val="19"/>
+              </w:rPr>
+              <w:t>拆开包装</w:t>
+            </w:r>
+          </w:p>
+        </w:tc>
+        <w:tc>
+          <w:tcPr>
+            <w:tcW w:type="dxa" w:w="4381"/>
+            <w:vAlign w:val="center"/>
+            <w:tcMar>
+              <w:top w:w="90" w:type="dxa"/>
+              <w:left w:w="90" w:type="dxa"/>
+              <w:bottom w:w="90" w:type="dxa"/>
+              <w:right w:w="90" w:type="dxa"/>
+            </w:tcMar>
+          </w:tcPr>
+          <w:p>
+            <w:pPr>
+              <w:keepNext w:val="0"/>
+              <w:spacing w:after="60" w:before="60" w:line="276" w:lineRule="auto"/>
+            </w:pPr>
+            <w:r>
+              <w:rPr>
+                <w:sz w:val="19"/>
+              </w:rPr>
+              <w:t>封条断开，盒盖打开，物品已取出</w:t>
+            </w:r>
+          </w:p>
+        </w:tc>
+        <w:tc>
+          <w:tcPr>
+            <w:tcW w:type="dxa" w:w="3797"/>
+            <w:vAlign w:val="center"/>
+            <w:tcMar>
+              <w:top w:w="90" w:type="dxa"/>
+              <w:left w:w="90" w:type="dxa"/>
+              <w:bottom w:w="90" w:type="dxa"/>
+              <w:right w:w="90" w:type="dxa"/>
+            </w:tcMar>
+          </w:tcPr>
+          <w:p>
+            <w:pPr>
+              <w:keepNext w:val="0"/>
+              <w:spacing w:after="60" w:before="60" w:line="276" w:lineRule="auto"/>
+            </w:pPr>
+            <w:r>
+              <w:rPr>
+                <w:sz w:val="19"/>
+              </w:rPr>
+              <w:t>收回、合盖或更换包装</w:t>
+            </w:r>
+          </w:p>
+        </w:tc>
+      </w:tr>
+      <w:tr>
+        <w:tc>
+          <w:tcPr>
+            <w:tcW w:type="dxa" w:w="1460"/>
+            <w:vAlign w:val="center"/>
+            <w:tcMar>
+              <w:top w:w="90" w:type="dxa"/>
+              <w:left w:w="90" w:type="dxa"/>
+              <w:bottom w:w="90" w:type="dxa"/>
+              <w:right w:w="90" w:type="dxa"/>
+            </w:tcMar>
+          </w:tcPr>
+          <w:p>
+            <w:pPr>
+              <w:keepNext w:val="0"/>
+              <w:spacing w:after="60" w:before="60" w:line="276" w:lineRule="auto"/>
+              <w:jc w:val="center"/>
+            </w:pPr>
+            <w:r>
+              <w:rPr>
+                <w:sz w:val="19"/>
+              </w:rPr>
+              <w:t>发现线索</w:t>
+            </w:r>
+          </w:p>
+        </w:tc>
+        <w:tc>
+          <w:tcPr>
+            <w:tcW w:type="dxa" w:w="4381"/>
+            <w:vAlign w:val="center"/>
+            <w:tcMar>
+              <w:top w:w="90" w:type="dxa"/>
+              <w:left w:w="90" w:type="dxa"/>
+              <w:bottom w:w="90" w:type="dxa"/>
+              <w:right w:w="90" w:type="dxa"/>
+            </w:tcMar>
+          </w:tcPr>
+          <w:p>
+            <w:pPr>
+              <w:keepNext w:val="0"/>
+              <w:spacing w:after="60" w:before="60" w:line="276" w:lineRule="auto"/>
+            </w:pPr>
+            <w:r>
+              <w:rPr>
+                <w:sz w:val="19"/>
+              </w:rPr>
+              <w:t>获得新信息，行动目标随之调整</w:t>
+            </w:r>
+          </w:p>
+        </w:tc>
+        <w:tc>
+          <w:tcPr>
+            <w:tcW w:type="dxa" w:w="3797"/>
+            <w:vAlign w:val="center"/>
+            <w:tcMar>
+              <w:top w:w="90" w:type="dxa"/>
+              <w:left w:w="90" w:type="dxa"/>
+              <w:bottom w:w="90" w:type="dxa"/>
+              <w:right w:w="90" w:type="dxa"/>
+            </w:tcMar>
+          </w:tcPr>
+          <w:p>
+            <w:pPr>
+              <w:keepNext w:val="0"/>
+              <w:spacing w:after="60" w:before="60" w:line="276" w:lineRule="auto"/>
+            </w:pPr>
+            <w:r>
+              <w:rPr>
+                <w:sz w:val="19"/>
+              </w:rPr>
+              <w:t>新证据或误读揭示修正判断</w:t>
+            </w:r>
+          </w:p>
+        </w:tc>
+      </w:tr>
+      <w:tr>
+        <w:tc>
+          <w:tcPr>
+            <w:tcW w:type="dxa" w:w="1460"/>
+            <w:vAlign w:val="center"/>
+            <w:tcMar>
+              <w:top w:w="90" w:type="dxa"/>
+              <w:left w:w="90" w:type="dxa"/>
+              <w:bottom w:w="90" w:type="dxa"/>
+              <w:right w:w="90" w:type="dxa"/>
+            </w:tcMar>
+          </w:tcPr>
+          <w:p>
+            <w:pPr>
+              <w:keepNext w:val="0"/>
+              <w:spacing w:after="60" w:before="60" w:line="276" w:lineRule="auto"/>
+              <w:jc w:val="center"/>
+            </w:pPr>
+            <w:r>
+              <w:rPr>
+                <w:sz w:val="19"/>
+              </w:rPr>
+              <w:t>协作装配</w:t>
+            </w:r>
+          </w:p>
+        </w:tc>
+        <w:tc>
+          <w:tcPr>
+            <w:tcW w:type="dxa" w:w="4381"/>
+            <w:vAlign w:val="center"/>
+            <w:tcMar>
+              <w:top w:w="90" w:type="dxa"/>
+              <w:left w:w="90" w:type="dxa"/>
+              <w:bottom w:w="90" w:type="dxa"/>
+              <w:right w:w="90" w:type="dxa"/>
+            </w:tcMar>
+          </w:tcPr>
+          <w:p>
+            <w:pPr>
+              <w:keepNext w:val="0"/>
+              <w:spacing w:after="60" w:before="60" w:line="276" w:lineRule="auto"/>
+            </w:pPr>
+            <w:r>
+              <w:rPr>
+                <w:sz w:val="19"/>
+              </w:rPr>
+              <w:t>部件已连接，进度与信任有变化</w:t>
+            </w:r>
+          </w:p>
+        </w:tc>
+        <w:tc>
+          <w:tcPr>
+            <w:tcW w:type="dxa" w:w="3797"/>
+            <w:vAlign w:val="center"/>
+            <w:tcMar>
+              <w:top w:w="90" w:type="dxa"/>
+              <w:left w:w="90" w:type="dxa"/>
+              <w:bottom w:w="90" w:type="dxa"/>
+              <w:right w:w="90" w:type="dxa"/>
+            </w:tcMar>
+          </w:tcPr>
+          <w:p>
+            <w:pPr>
+              <w:keepNext w:val="0"/>
+              <w:spacing w:after="60" w:before="60" w:line="276" w:lineRule="auto"/>
+            </w:pPr>
+            <w:r>
+              <w:rPr>
+                <w:sz w:val="19"/>
+              </w:rPr>
+              <w:t>拆卸、返工或新的互动</w:t>
+            </w:r>
+          </w:p>
+        </w:tc>
+      </w:tr>
+      <w:tr>
+        <w:tc>
+          <w:tcPr>
+            <w:tcW w:type="dxa" w:w="1460"/>
+            <w:vAlign w:val="center"/>
+            <w:tcMar>
+              <w:top w:w="90" w:type="dxa"/>
+              <w:left w:w="90" w:type="dxa"/>
+              <w:bottom w:w="90" w:type="dxa"/>
+              <w:right w:w="90" w:type="dxa"/>
+            </w:tcMar>
+          </w:tcPr>
+          <w:p>
+            <w:pPr>
+              <w:keepNext w:val="0"/>
+              <w:spacing w:after="60" w:before="60" w:line="276" w:lineRule="auto"/>
+              <w:jc w:val="center"/>
+            </w:pPr>
+            <w:r>
+              <w:rPr>
+                <w:sz w:val="19"/>
+              </w:rPr>
+              <w:t>种植生长</w:t>
+            </w:r>
+          </w:p>
+        </w:tc>
+        <w:tc>
+          <w:tcPr>
+            <w:tcW w:type="dxa" w:w="4381"/>
+            <w:vAlign w:val="center"/>
+            <w:tcMar>
+              <w:top w:w="90" w:type="dxa"/>
+              <w:left w:w="90" w:type="dxa"/>
+              <w:bottom w:w="90" w:type="dxa"/>
+              <w:right w:w="90" w:type="dxa"/>
+            </w:tcMar>
+          </w:tcPr>
+          <w:p>
+            <w:pPr>
+              <w:keepNext w:val="0"/>
+              <w:spacing w:after="60" w:before="60" w:line="276" w:lineRule="auto"/>
+            </w:pPr>
+            <w:r>
+              <w:rPr>
+                <w:sz w:val="19"/>
+              </w:rPr>
+              <w:t>位置不变，土壤和生长阶段推进</w:t>
+            </w:r>
+          </w:p>
+        </w:tc>
+        <w:tc>
+          <w:tcPr>
+            <w:tcW w:type="dxa" w:w="3797"/>
+            <w:vAlign w:val="center"/>
+            <w:tcMar>
+              <w:top w:w="90" w:type="dxa"/>
+              <w:left w:w="90" w:type="dxa"/>
+              <w:bottom w:w="90" w:type="dxa"/>
+              <w:right w:w="90" w:type="dxa"/>
+            </w:tcMar>
+          </w:tcPr>
+          <w:p>
+            <w:pPr>
+              <w:keepNext w:val="0"/>
+              <w:spacing w:after="60" w:before="60" w:line="276" w:lineRule="auto"/>
+            </w:pPr>
+            <w:r>
+              <w:rPr>
+                <w:sz w:val="19"/>
+              </w:rPr>
+              <w:t>浇水、天气或时间经过</w:t>
+            </w:r>
+          </w:p>
+        </w:tc>
+      </w:tr>
+    </w:tbl>
+    <w:p>
+      <w:pPr>
+        <w:spacing w:after="40"/>
+      </w:pPr>
+    </w:p>
+    <w:p>
+      <w:r>
+        <w:t>按题材选用，不强加全部类别。真实产品的数量、结构与操作以可靠资料为准，剧情效果不能冒充产品功效。</w:t>
+      </w:r>
+    </w:p>
+    <w:p>
+      <w:pPr>
+        <w:pStyle w:val="Heading2"/>
+      </w:pPr>
+      <w:r>
+        <w:t>把变化落到动态与必要阶段资产</w:t>
+      </w:r>
+    </w:p>
+    <w:p>
+      <w:r>
+        <w:t>事件先发生，结果随后出现，不能倒水前就满杯、发现线索前就知道答案、装配前就成品。下一段从已有进度继续，不重新开箱、重复发现或自动还原关系。设计闪回、梦境或重置时，明确所属时间及进入、退出条件。</w:t>
+      </w:r>
+    </w:p>
+    <w:p>
+      <w:r>
+        <w:t>资产卡交齐稳定身份和必要阶段图词，实际参考图按所选模式需要派生；身份母版不能清除累积状态。视频块只写当前动作起点、状态差异、本段变化及持续结果，不重抄定妆，不让用户自行组装。</w:t>
+      </w:r>
+    </w:p>
+    <w:p>
+      <w:r>
+        <w:t xml:space="preserve">详见 </w:t>
+      </w:r>
+      <w:r>
+        <w:t>references/story-consequences.md</w:t>
+      </w:r>
+      <w:r>
+        <w:t>。核对“原状态 → 事件 → 新状态 → 后段承接”，再检查实际视频；文字详细不等于模型必然正确执行。</w:t>
       </w:r>
     </w:p>
     <w:sectPr>

</xml_diff>